<commit_message>
Require live LLMs (Azure/OpenAI/Groq), improve speech/Azure Foundry support, and style table data without bold Drop rule-based mapper/validator fallbacks, show LLM availability in the UI, fix Azure structured-output schemas, and keep table body cells non-bold.
</commit_message>
<xml_diff>
--- a/samples/templates/contract_template.docx
+++ b/samples/templates/contract_template.docx
@@ -28,6 +28,13 @@
           <w:sz w:val="24"/>
           <w:szCs w:val="24"/>
         </w:rPr>
+        <w:t xml:space="preserve">Date: </w:t>
+      </w:r>
+      <w:r>
+        <w:rPr>
+          <w:sz w:val="24"/>
+          <w:szCs w:val="24"/>
+        </w:rPr>
         <w:t>&lt;DATE&gt;</w:t>
       </w:r>
     </w:p>
@@ -61,6 +68,13 @@
           <w:szCs w:val="24"/>
         </w:rPr>
         <w:t>Agreement Number –</w:t>
+      </w:r>
+      <w:r>
+        <w:rPr>
+          <w:sz w:val="24"/>
+          <w:szCs w:val="24"/>
+        </w:rPr>
+        <w:t xml:space="preserve"> &lt;AGGREEMENT-NUMBER&gt;</w:t>
       </w:r>
     </w:p>
     <w:p>
@@ -158,12 +172,6 @@
         <w:gridCol w:w="1565"/>
       </w:tblGrid>
       <w:tr>
-        <w:tblPrEx>
-          <w:tblCellMar>
-            <w:top w:w="0" w:type="dxa"/>
-            <w:bottom w:w="0" w:type="dxa"/>
-          </w:tblCellMar>
-        </w:tblPrEx>
         <w:trPr>
           <w:tblHeader/>
         </w:trPr>
@@ -313,12 +321,6 @@
         </w:tc>
       </w:tr>
       <w:tr>
-        <w:tblPrEx>
-          <w:tblCellMar>
-            <w:top w:w="0" w:type="dxa"/>
-            <w:bottom w:w="0" w:type="dxa"/>
-          </w:tblCellMar>
-        </w:tblPrEx>
         <w:tc>
           <w:tcPr>
             <w:tcW w:w="1087" w:type="dxa"/>

</xml_diff>